<commit_message>
feat: new check template
</commit_message>
<xml_diff>
--- a/src/utils/template.docx
+++ b/src/utils/template.docx
@@ -521,8 +521,6 @@
         </w:rPr>
         <w:t>Для собственного потребления и (или) производства</w:t>
       </w:r>
-      <w:bookmarkStart w:id="0" w:name="_GoBack"/>
-      <w:bookmarkEnd w:id="0"/>
     </w:p>
     <w:p>
       <w:pPr>
@@ -728,27 +726,18 @@
           <w:sz w:val="24"/>
           <w:szCs w:val="24"/>
         </w:rPr>
-        <w:t xml:space="preserve">Всего к </w:t>
-      </w:r>
-      <w:proofErr w:type="gramStart"/>
-      <w:r>
-        <w:rPr>
-          <w:rFonts w:ascii="Times New Roman" w:hAnsi="Times New Roman" w:cs="Times New Roman"/>
-          <w:b/>
-          <w:sz w:val="24"/>
-          <w:szCs w:val="24"/>
-        </w:rPr>
-        <w:t>оплате  на</w:t>
-      </w:r>
-      <w:proofErr w:type="gramEnd"/>
-      <w:r>
-        <w:rPr>
-          <w:rFonts w:ascii="Times New Roman" w:hAnsi="Times New Roman" w:cs="Times New Roman"/>
-          <w:b/>
-          <w:sz w:val="24"/>
-          <w:szCs w:val="24"/>
-        </w:rPr>
-        <w:t xml:space="preserve"> сумму с НДС: {{</w:t>
+        <w:t xml:space="preserve">Всего к оплате </w:t>
+      </w:r>
+      <w:bookmarkStart w:id="0" w:name="_GoBack"/>
+      <w:bookmarkEnd w:id="0"/>
+      <w:r>
+        <w:rPr>
+          <w:rFonts w:ascii="Times New Roman" w:hAnsi="Times New Roman" w:cs="Times New Roman"/>
+          <w:b/>
+          <w:sz w:val="24"/>
+          <w:szCs w:val="24"/>
+        </w:rPr>
+        <w:t>на сумму с НДС: {{</w:t>
       </w:r>
       <w:proofErr w:type="spellStart"/>
       <w:r>

</xml_diff>